<commit_message>
feat(tables): update Table 5, 6, and 7 to 17 categories with full consistency across Table 3, Table 5, Table 6, Table 7, and Figure 4
</commit_message>
<xml_diff>
--- a/publication/manuscripts/LLM4AE_rev1_clean.docx
+++ b/publication/manuscripts/LLM4AE_rev1_clean.docx
@@ -5189,7 +5189,7 @@
     </w:p>
     <w:p>
       <w:r>
-        <w:t>We trained and evaluated a supervised BioBERT named entity recognition (NER) model using a 4-fold Leave-One-Drug-Event-Pair-Out cross-validation design on the 829 FAERS narratives. Table 3 summarizes the overall benchmark comparison across model families, input paradigms, and evaluation tiers. BioBERT achieved a strict exact-match F1 of 0.5258 and an adapted ADE-Eval F1 of 0.6698, which substantially outperformed the few-shot LLaMA-4 (0.3542 Strict, 0.5098 Adapted), Claude 4.6 Sonnet (0.4222 Strict, 0.5786 Adapted), and baseline ETHER system (0.1147 Strict, 0.2447 Adapted). Figure 4 details the fine-grained category-level performance breakdown across all 17 clinical concept categories.</w:t>
+        <w:t>We trained and evaluated a supervised BioBERT named entity recognition (NER) model using a 4-fold Leave-One-Drug-Event-Pair-Out cross-validation design on the 829 FAERS narratives across all 17 clinical concept categories. Table 3 summarizes the overall benchmark comparison across model families, input paradigms, and evaluation tiers. BioBERT achieved a strict exact-match F1 of 0.5685 ± 0.0080 and an adapted ADE-Eval F1 of 0.7463 ± 0.0076, which substantially outperformed few-shot LLaMA 4 (0.4043 Strict, 0.6249 Adapted), Claude 4.6 Sonnet (0.4667 Strict, 0.6443 Adapted), and baseline ETHER system (0.1147 Strict, 0.2447 Adapted). Figure 4 details the fine-grained category-level performance breakdown across all 17 clinical concept categories.</w:t>
       </w:r>
     </w:p>
     <w:p>
@@ -5478,7 +5478,7 @@
                 <w:color w:val="222222"/>
                 <w:sz w:val="16"/>
               </w:rPr>
-              <w:t>0.5258 ± 0.0097</w:t>
+              <w:t>0.5685 ± 0.0080</w:t>
             </w:r>
           </w:p>
         </w:tc>
@@ -5507,7 +5507,7 @@
                 <w:color w:val="222222"/>
                 <w:sz w:val="16"/>
               </w:rPr>
-              <w:t>0.6698 ± 0.0095</w:t>
+              <w:t>0.7463 ± 0.0076</w:t>
             </w:r>
           </w:p>
         </w:tc>
@@ -5772,7 +5772,7 @@
                 <w:color w:val="222222"/>
                 <w:sz w:val="16"/>
               </w:rPr>
-              <w:t>0.3542</w:t>
+              <w:t>0.4043</w:t>
             </w:r>
           </w:p>
         </w:tc>
@@ -5801,7 +5801,7 @@
                 <w:color w:val="222222"/>
                 <w:sz w:val="16"/>
               </w:rPr>
-              <w:t>0.5098</w:t>
+              <w:t>0.6249</w:t>
             </w:r>
           </w:p>
         </w:tc>
@@ -5919,7 +5919,7 @@
                 <w:color w:val="222222"/>
                 <w:sz w:val="16"/>
               </w:rPr>
-              <w:t>0.3200</w:t>
+              <w:t>0.4071</w:t>
             </w:r>
           </w:p>
         </w:tc>
@@ -5948,7 +5948,7 @@
                 <w:color w:val="222222"/>
                 <w:sz w:val="16"/>
               </w:rPr>
-              <w:t>0.4700</w:t>
+              <w:t>0.5995</w:t>
             </w:r>
           </w:p>
         </w:tc>
@@ -6066,7 +6066,7 @@
                 <w:color w:val="222222"/>
                 <w:sz w:val="16"/>
               </w:rPr>
-              <w:t>0.4222</w:t>
+              <w:t>0.4667</w:t>
             </w:r>
           </w:p>
         </w:tc>
@@ -6095,7 +6095,7 @@
                 <w:color w:val="222222"/>
                 <w:sz w:val="16"/>
               </w:rPr>
-              <w:t>0.5786</w:t>
+              <w:t>0.6443</w:t>
             </w:r>
           </w:p>
         </w:tc>
@@ -7395,7 +7395,7 @@
     </w:p>
     <w:p>
       <w:r>
-        <w:t>We applied a repeated Leave-One-Drug-Event-Pair-Out cross-validation protocol on the FAERS corpus to evaluate model generalization across distinct therapeutic contexts. For each of the 4 curated drug-event cohorts, the model was trained on the remaining 3 case series and evaluated on the held-out series. As shown in Table 5, strict exact-match F1 was 0.6280 ± 0.0097 for azacitidine–QT prolongation (N = 200), 0.6563 ± 0.0178 for baricitinib–hypersensitivity (N = 200), 0.5602 ± 0.0091 for tramadol–hypoglycemia (N = 229), and 0.5274 ± 0.0105 for erenumab–stroke (N = 200), yielding a macro-average F1 of 0.5930 ± 0.0118 across folds (0.7173 ± 0.0103 Adapted F1). The between-series performance variance exceeded within-fold variation, demonstrating that narrative complexity and therapeutic vocabulary differences contribute more variation than stochastic model initialization.</w:t>
+        <w:t>We applied a repeated Leave-One-Drug-Event-Pair-Out cross-validation protocol on the FAERS corpus to evaluate model generalization across distinct therapeutic contexts on all 17 clinical concept categories. For each of the 4 curated drug-event cohorts, the model was trained on the remaining 3 case series and evaluated on the held-out series. As shown in Table 5, strict exact-match F1 was 0.6002 ± 0.0114 for azacitidine–QT prolongation (N = 200), 0.6367 ± 0.0201 for baricitinib–hypersensitivity (N = 200), 0.5289 ± 0.0093 for tramadol–hypoglycemia (N = 229), and 0.5084 ± 0.0122 for erenumab–stroke (N = 200), yielding a macro-average F1 of 0.5685 ± 0.0080 across folds (0.7463 ± 0.0076 Adapted F1). The between-series performance variance exceeded within-fold variation, demonstrating that narrative complexity and therapeutic vocabulary differences contribute more variation than stochastic model initialization.</w:t>
       </w:r>
     </w:p>
     <w:p>
@@ -7625,7 +7625,7 @@
                 <w:color w:val="222222"/>
                 <w:sz w:val="16"/>
               </w:rPr>
-              <w:t>0.6280 ± 0.0097</w:t>
+              <w:t>0.6002 ± 0.0114</w:t>
             </w:r>
           </w:p>
         </w:tc>
@@ -7654,7 +7654,7 @@
                 <w:color w:val="222222"/>
                 <w:sz w:val="16"/>
               </w:rPr>
-              <w:t>0.7412 ± 0.0085</w:t>
+              <w:t>0.7733 ± 0.0092</w:t>
             </w:r>
           </w:p>
         </w:tc>
@@ -7743,7 +7743,7 @@
                 <w:color w:val="222222"/>
                 <w:sz w:val="16"/>
               </w:rPr>
-              <w:t>0.6563 ± 0.0178</w:t>
+              <w:t>0.6367 ± 0.0201</w:t>
             </w:r>
           </w:p>
         </w:tc>
@@ -7772,7 +7772,7 @@
                 <w:color w:val="222222"/>
                 <w:sz w:val="16"/>
               </w:rPr>
-              <w:t>0.7850 ± 0.0142</w:t>
+              <w:t>0.7751 ± 0.0128</w:t>
             </w:r>
           </w:p>
         </w:tc>
@@ -7861,7 +7861,7 @@
                 <w:color w:val="222222"/>
                 <w:sz w:val="16"/>
               </w:rPr>
-              <w:t>0.5602 ± 0.0091</w:t>
+              <w:t>0.5289 ± 0.0093</w:t>
             </w:r>
           </w:p>
         </w:tc>
@@ -7890,7 +7890,7 @@
                 <w:color w:val="222222"/>
                 <w:sz w:val="16"/>
               </w:rPr>
-              <w:t>0.6920 ± 0.0088</w:t>
+              <w:t>0.7242 ± 0.0036</w:t>
             </w:r>
           </w:p>
         </w:tc>
@@ -7979,7 +7979,7 @@
                 <w:color w:val="222222"/>
                 <w:sz w:val="16"/>
               </w:rPr>
-              <w:t>0.5274 ± 0.0105</w:t>
+              <w:t>0.5084 ± 0.0122</w:t>
             </w:r>
           </w:p>
         </w:tc>
@@ -8008,7 +8008,7 @@
                 <w:color w:val="222222"/>
                 <w:sz w:val="16"/>
               </w:rPr>
-              <w:t>0.6510 ± 0.0098</w:t>
+              <w:t>0.7126 ± 0.0077</w:t>
             </w:r>
           </w:p>
         </w:tc>
@@ -8097,7 +8097,7 @@
                 <w:color w:val="222222"/>
                 <w:sz w:val="16"/>
               </w:rPr>
-              <w:t>0.5930 ± 0.0118</w:t>
+              <w:t>0.5685 ± 0.0080</w:t>
             </w:r>
           </w:p>
         </w:tc>
@@ -8126,7 +8126,7 @@
                 <w:color w:val="222222"/>
                 <w:sz w:val="16"/>
               </w:rPr>
-              <w:t>0.7173 ± 0.0103</w:t>
+              <w:t>0.7463 ± 0.0076</w:t>
             </w:r>
           </w:p>
         </w:tc>
@@ -8146,7 +8146,7 @@
     </w:p>
     <w:p>
       <w:r>
-        <w:t>To rigorously verify neural network optimization stability, we conducted 5 independent training runs using random initialization seeds (42, 123, 456, 789, 1011) across both FAERS 4-fold LOO (20 total model runs) and VAERS 10-fold CV (50 total model runs). As summarized in Table 6, cross-seed variance was exceptionally low across both datasets. On FAERS, strict F1 averaged 0.5685 ± 0.0080 (0.7463 ± 0.0076 Adapted F1) across the 5 seeds. On VAERS, strict F1 averaged 0.6595 ± 0.0015 (0.7882 ± 0.0022 Adapted F1) across the 5 seeds. These findings confirm that supervised BioBERT convergence is remarkably robust to stochastic weight initialization, with between-series clinical diversity accounting for substantially greater performance variance than random initialization.</w:t>
+        <w:t>To rigorously verify neural network optimization stability, we conducted 5 independent training runs using random initialization seeds (42, 123, 456, 789, 1011) across both FAERS 4-fold LOO (20 total model runs, 17 categories) and VAERS 10-fold CV (50 total model runs, 14 categories). As summarized in Table 6, cross-seed variance was exceptionally low across both datasets. On FAERS, strict F1 averaged 0.5685 ± 0.0080 (0.7463 ± 0.0076 Adapted F1) across the 5 seeds. On VAERS, strict F1 averaged 0.6595 ± 0.0015 (0.7882 ± 0.0022 Adapted F1) across the 5 seeds. These findings confirm that supervised BioBERT convergence is remarkably robust to stochastic weight initialization, with between-series clinical diversity accounting for substantially greater performance variance than random initialization.</w:t>
       </w:r>
     </w:p>
     <w:p>
@@ -9983,7 +9983,7 @@
                 <w:color w:val="222222"/>
                 <w:sz w:val="16"/>
               </w:rPr>
-              <w:t>0.3542</w:t>
+              <w:t>0.4043</w:t>
             </w:r>
           </w:p>
         </w:tc>
@@ -10012,7 +10012,7 @@
                 <w:color w:val="222222"/>
                 <w:sz w:val="16"/>
               </w:rPr>
-              <w:t>0.5098</w:t>
+              <w:t>0.6249</w:t>
             </w:r>
           </w:p>
         </w:tc>
@@ -10130,7 +10130,7 @@
                 <w:color w:val="222222"/>
                 <w:sz w:val="16"/>
               </w:rPr>
-              <w:t>0.3200</w:t>
+              <w:t>0.4071</w:t>
             </w:r>
           </w:p>
         </w:tc>
@@ -10159,7 +10159,7 @@
                 <w:color w:val="222222"/>
                 <w:sz w:val="16"/>
               </w:rPr>
-              <w:t>0.4700</w:t>
+              <w:t>0.5995</w:t>
             </w:r>
           </w:p>
         </w:tc>
@@ -10277,7 +10277,7 @@
                 <w:color w:val="222222"/>
                 <w:sz w:val="16"/>
               </w:rPr>
-              <w:t>0.4222</w:t>
+              <w:t>0.4667</w:t>
             </w:r>
           </w:p>
         </w:tc>
@@ -10306,7 +10306,7 @@
                 <w:color w:val="222222"/>
                 <w:sz w:val="16"/>
               </w:rPr>
-              <w:t>0.5786</w:t>
+              <w:t>0.6443</w:t>
             </w:r>
           </w:p>
         </w:tc>

</xml_diff>

<commit_message>
feat(ablation): add analyze_bert_ablation.py, generate Table 8 (BERT encoder architecture ablation), and insert into Section 3.6 of clean manuscript
</commit_message>
<xml_diff>
--- a/publication/manuscripts/LLM4AE_rev1_clean.docx
+++ b/publication/manuscripts/LLM4AE_rev1_clean.docx
@@ -9723,7 +9723,7 @@
     </w:p>
     <w:p>
       <w:r>
-        <w:t>We investigated whether the output representation paradigm impacts generative LLM extraction fidelity. We benchmarked two structured output paradigms on FAERS (Table 7): (1) Inline Tagged XML (P2_TAG), where the LLM embeds XML tags directly into the narrative text, versus (2) JSON Schema, where the LLM produces a structured JSON array of extracted entity spans and character offsets. The inline XML tagging approach achieved substantially superior strict F1 (0.3542 vs. 0.3200) and adapted F1 (0.5098 vs. 0.4700) with a 100.0% boundary alignment reconstruction rate, whereas JSON generation suffered from a 6.6% failure rate due to character offset hallucination and coordinate drift over long narratives.</w:t>
+        <w:t>We investigated whether the output representation paradigm impacts generative LLM extraction fidelity. We benchmarked two structured output paradigms on FAERS (Table 7): (1) Inline Tagged XML (P2_TAG), where the LLM embeds XML tags directly into the narrative text, versus (2) JSON Schema, where the LLM produces a structured JSON array of extracted entity spans and character offsets across the 17 clinical concept categories. The inline XML tagging approach achieved higher adapted ADE F1 (0.6249 vs. 0.5995) and higher recall (0.5796 vs. 0.5232) with a 100.0% boundary alignment reconstruction rate, whereas JSON generation suppressed non-overlapping spurious entities by 25.9% (yielding higher strict precision, 0.3785 vs. 0.3470) but suffered from a 6.6% misalignment rate due to character offset hallucination and coordinate drift over long narratives.</w:t>
       </w:r>
     </w:p>
     <w:p>
@@ -10336,6 +10336,1243 @@
                 <w:sz w:val="16"/>
               </w:rPr>
               <w:t>100.0%</w:t>
+            </w:r>
+          </w:p>
+        </w:tc>
+      </w:tr>
+    </w:tbl>
+    <w:p>
+      <w:pPr>
+        <w:spacing w:before="240" w:after="80"/>
+      </w:pPr>
+      <w:r>
+        <w:rPr>
+          <w:rFonts w:ascii="Arial" w:hAnsi="Arial"/>
+          <w:b/>
+          <w:i w:val="0"/>
+          <w:sz w:val="22"/>
+        </w:rPr>
+        <w:t>Pretrained Transformer Encoder Architecture Ablation</w:t>
+      </w:r>
+    </w:p>
+    <w:p>
+      <w:pPr>
+        <w:spacing w:before="60" w:after="80"/>
+      </w:pPr>
+      <w:r>
+        <w:rPr>
+          <w:rFonts w:ascii="Arial" w:hAnsi="Arial"/>
+          <w:b w:val="0"/>
+          <w:i w:val="0"/>
+          <w:sz w:val="19"/>
+        </w:rPr>
+        <w:t>To investigate the impact of underlying pretraining corpora on pharmacovigilance concept extraction, we conducted an ablation study comparing four transformer encoder architectures on the VAERS dataset across 5 independent random initialization seeds (Table 8): BioBERT (pretrained on PubMed and PMC biomedical literature), Bio_ClinicalBERT (initialized from BioBERT and further trained on MIMIC-III EHR notes), general-domain BERT-Base (Wikipedia and BooksCorpus), and ClinicalBERT (MIMIC-III clinical records). BioBERT achieved the highest validation F1 (0.8471 ± 0.0058, Precision = 0.8666, Recall = 0.8285), demonstrating that broad biomedical scientific literature provides superior token representations for vaccine adverse event terminology. Bio_ClinicalBERT showed the fastest optimization convergence (optimal checkpoint at step 1,080, F1 = 0.8433 ± 0.0070), while general-domain BERT-Base achieved robust optimization (F1 = 0.8382 ± 0.0047) but required longer training (step 2,160). All four encoder variants exhibited narrow cross-seed variance (SD &lt; 0.009), further substantiating the stability of supervised encoder fine-tuning.</w:t>
+      </w:r>
+    </w:p>
+    <w:p>
+      <w:pPr>
+        <w:spacing w:before="120" w:after="60"/>
+      </w:pPr>
+      <w:r>
+        <w:rPr>
+          <w:rFonts w:ascii="Arial" w:hAnsi="Arial"/>
+          <w:b/>
+          <w:i w:val="0"/>
+          <w:sz w:val="19"/>
+        </w:rPr>
+        <w:t>Table 8. Pretrained Transformer Encoder Architecture Ablation on the VAERS Dataset Across Five Independent Random Initialization Seeds (N = 1,000 Reports).</w:t>
+      </w:r>
+    </w:p>
+    <w:tbl>
+      <w:tblPr>
+        <w:tblW w:type="auto" w:w="0"/>
+        <w:jc w:val="center"/>
+        <w:tblLook w:firstColumn="1" w:firstRow="1" w:lastColumn="0" w:lastRow="0" w:noHBand="0" w:noVBand="1" w:val="04A0"/>
+        <w:tblBorders>
+          <w:top w:val="single" w:sz="8" w:space="0" w:color="333333"/>
+          <w:bottom w:val="single" w:sz="8" w:space="0" w:color="333333"/>
+          <w:insideH w:val="single" w:sz="4" w:space="0" w:color="E0E0E0"/>
+          <w:insideV w:val="none"/>
+          <w:left w:val="none"/>
+          <w:right w:val="none"/>
+        </w:tblBorders>
+      </w:tblPr>
+      <w:tblGrid>
+        <w:gridCol w:w="1170"/>
+        <w:gridCol w:w="1170"/>
+        <w:gridCol w:w="1170"/>
+        <w:gridCol w:w="1170"/>
+        <w:gridCol w:w="1170"/>
+        <w:gridCol w:w="1170"/>
+        <w:gridCol w:w="1170"/>
+        <w:gridCol w:w="1170"/>
+      </w:tblGrid>
+      <w:tr>
+        <w:tc>
+          <w:tcPr>
+            <w:tcW w:type="dxa" w:w="1872"/>
+            <w:shd w:fill="F2F4F8"/>
+            <w:tcMar>
+              <w:top w:w="60" w:type="dxa"/>
+              <w:bottom w:w="60" w:type="dxa"/>
+              <w:left w:w="90" w:type="dxa"/>
+              <w:right w:w="90" w:type="dxa"/>
+            </w:tcMar>
+            <w:vAlign w:val="center"/>
+          </w:tcPr>
+          <w:p>
+            <w:pPr>
+              <w:spacing w:before="30" w:after="30"/>
+              <w:jc w:val="center"/>
+            </w:pPr>
+            <w:r/>
+            <w:r>
+              <w:rPr>
+                <w:rFonts w:ascii="Arial" w:hAnsi="Arial"/>
+                <w:b/>
+                <w:color w:val="111111"/>
+                <w:sz w:val="16"/>
+              </w:rPr>
+              <w:t>Model Architecture</w:t>
+            </w:r>
+          </w:p>
+        </w:tc>
+        <w:tc>
+          <w:tcPr>
+            <w:tcW w:type="dxa" w:w="2592"/>
+            <w:shd w:fill="F2F4F8"/>
+            <w:tcMar>
+              <w:top w:w="60" w:type="dxa"/>
+              <w:bottom w:w="60" w:type="dxa"/>
+              <w:left w:w="90" w:type="dxa"/>
+              <w:right w:w="90" w:type="dxa"/>
+            </w:tcMar>
+            <w:vAlign w:val="center"/>
+          </w:tcPr>
+          <w:p>
+            <w:pPr>
+              <w:spacing w:before="30" w:after="30"/>
+              <w:jc w:val="center"/>
+            </w:pPr>
+            <w:r/>
+            <w:r>
+              <w:rPr>
+                <w:rFonts w:ascii="Arial" w:hAnsi="Arial"/>
+                <w:b/>
+                <w:color w:val="111111"/>
+                <w:sz w:val="16"/>
+              </w:rPr>
+              <w:t>Pretrained Checkpoint</w:t>
+            </w:r>
+          </w:p>
+        </w:tc>
+        <w:tc>
+          <w:tcPr>
+            <w:tcW w:type="dxa" w:w="2448"/>
+            <w:shd w:fill="F2F4F8"/>
+            <w:tcMar>
+              <w:top w:w="60" w:type="dxa"/>
+              <w:bottom w:w="60" w:type="dxa"/>
+              <w:left w:w="90" w:type="dxa"/>
+              <w:right w:w="90" w:type="dxa"/>
+            </w:tcMar>
+            <w:vAlign w:val="center"/>
+          </w:tcPr>
+          <w:p>
+            <w:pPr>
+              <w:spacing w:before="30" w:after="30"/>
+              <w:jc w:val="center"/>
+            </w:pPr>
+            <w:r/>
+            <w:r>
+              <w:rPr>
+                <w:rFonts w:ascii="Arial" w:hAnsi="Arial"/>
+                <w:b/>
+                <w:color w:val="111111"/>
+                <w:sz w:val="16"/>
+              </w:rPr>
+              <w:t>Pretraining Domain</w:t>
+            </w:r>
+          </w:p>
+        </w:tc>
+        <w:tc>
+          <w:tcPr>
+            <w:tcW w:type="dxa" w:w="1584"/>
+            <w:shd w:fill="F2F4F8"/>
+            <w:tcMar>
+              <w:top w:w="60" w:type="dxa"/>
+              <w:bottom w:w="60" w:type="dxa"/>
+              <w:left w:w="90" w:type="dxa"/>
+              <w:right w:w="90" w:type="dxa"/>
+            </w:tcMar>
+            <w:vAlign w:val="center"/>
+          </w:tcPr>
+          <w:p>
+            <w:pPr>
+              <w:spacing w:before="30" w:after="30"/>
+              <w:jc w:val="center"/>
+            </w:pPr>
+            <w:r/>
+            <w:r>
+              <w:rPr>
+                <w:rFonts w:ascii="Arial" w:hAnsi="Arial"/>
+                <w:b/>
+                <w:color w:val="111111"/>
+                <w:sz w:val="16"/>
+              </w:rPr>
+              <w:t>Validation F1 (Mean ± SD)</w:t>
+            </w:r>
+          </w:p>
+        </w:tc>
+        <w:tc>
+          <w:tcPr>
+            <w:tcW w:type="dxa" w:w="1440"/>
+            <w:shd w:fill="F2F4F8"/>
+            <w:tcMar>
+              <w:top w:w="60" w:type="dxa"/>
+              <w:bottom w:w="60" w:type="dxa"/>
+              <w:left w:w="90" w:type="dxa"/>
+              <w:right w:w="90" w:type="dxa"/>
+            </w:tcMar>
+            <w:vAlign w:val="center"/>
+          </w:tcPr>
+          <w:p>
+            <w:pPr>
+              <w:spacing w:before="30" w:after="30"/>
+              <w:jc w:val="center"/>
+            </w:pPr>
+            <w:r/>
+            <w:r>
+              <w:rPr>
+                <w:rFonts w:ascii="Arial" w:hAnsi="Arial"/>
+                <w:b/>
+                <w:color w:val="111111"/>
+                <w:sz w:val="16"/>
+              </w:rPr>
+              <w:t>Validation Precision</w:t>
+            </w:r>
+          </w:p>
+        </w:tc>
+        <w:tc>
+          <w:tcPr>
+            <w:tcW w:type="dxa" w:w="1440"/>
+            <w:shd w:fill="F2F4F8"/>
+            <w:tcMar>
+              <w:top w:w="60" w:type="dxa"/>
+              <w:bottom w:w="60" w:type="dxa"/>
+              <w:left w:w="90" w:type="dxa"/>
+              <w:right w:w="90" w:type="dxa"/>
+            </w:tcMar>
+            <w:vAlign w:val="center"/>
+          </w:tcPr>
+          <w:p>
+            <w:pPr>
+              <w:spacing w:before="30" w:after="30"/>
+              <w:jc w:val="center"/>
+            </w:pPr>
+            <w:r/>
+            <w:r>
+              <w:rPr>
+                <w:rFonts w:ascii="Arial" w:hAnsi="Arial"/>
+                <w:b/>
+                <w:color w:val="111111"/>
+                <w:sz w:val="16"/>
+              </w:rPr>
+              <w:t>Validation Recall</w:t>
+            </w:r>
+          </w:p>
+        </w:tc>
+        <w:tc>
+          <w:tcPr>
+            <w:tcW w:type="dxa" w:w="1296"/>
+            <w:shd w:fill="F2F4F8"/>
+            <w:tcMar>
+              <w:top w:w="60" w:type="dxa"/>
+              <w:bottom w:w="60" w:type="dxa"/>
+              <w:left w:w="90" w:type="dxa"/>
+              <w:right w:w="90" w:type="dxa"/>
+            </w:tcMar>
+            <w:vAlign w:val="center"/>
+          </w:tcPr>
+          <w:p>
+            <w:pPr>
+              <w:spacing w:before="30" w:after="30"/>
+              <w:jc w:val="center"/>
+            </w:pPr>
+            <w:r/>
+            <w:r>
+              <w:rPr>
+                <w:rFonts w:ascii="Arial" w:hAnsi="Arial"/>
+                <w:b/>
+                <w:color w:val="111111"/>
+                <w:sz w:val="16"/>
+              </w:rPr>
+              <w:t>Clinical Score</w:t>
+            </w:r>
+          </w:p>
+        </w:tc>
+        <w:tc>
+          <w:tcPr>
+            <w:tcW w:type="dxa" w:w="1296"/>
+            <w:shd w:fill="F2F4F8"/>
+            <w:tcMar>
+              <w:top w:w="60" w:type="dxa"/>
+              <w:bottom w:w="60" w:type="dxa"/>
+              <w:left w:w="90" w:type="dxa"/>
+              <w:right w:w="90" w:type="dxa"/>
+            </w:tcMar>
+            <w:vAlign w:val="center"/>
+          </w:tcPr>
+          <w:p>
+            <w:pPr>
+              <w:spacing w:before="30" w:after="30"/>
+              <w:jc w:val="center"/>
+            </w:pPr>
+            <w:r/>
+            <w:r>
+              <w:rPr>
+                <w:rFonts w:ascii="Arial" w:hAnsi="Arial"/>
+                <w:b/>
+                <w:color w:val="111111"/>
+                <w:sz w:val="16"/>
+              </w:rPr>
+              <w:t>Optimal Convergence Step</w:t>
+            </w:r>
+          </w:p>
+        </w:tc>
+      </w:tr>
+      <w:tr>
+        <w:tc>
+          <w:tcPr>
+            <w:tcW w:type="dxa" w:w="1872"/>
+            <w:shd w:fill="FFFFFF"/>
+            <w:tcMar>
+              <w:top w:w="60" w:type="dxa"/>
+              <w:bottom w:w="60" w:type="dxa"/>
+              <w:left w:w="90" w:type="dxa"/>
+              <w:right w:w="90" w:type="dxa"/>
+            </w:tcMar>
+            <w:vAlign w:val="center"/>
+          </w:tcPr>
+          <w:p>
+            <w:pPr>
+              <w:spacing w:before="30" w:after="30"/>
+              <w:jc w:val="left"/>
+            </w:pPr>
+            <w:r/>
+            <w:r>
+              <w:rPr>
+                <w:rFonts w:ascii="Arial" w:hAnsi="Arial"/>
+                <w:b/>
+                <w:color w:val="222222"/>
+                <w:sz w:val="16"/>
+              </w:rPr>
+              <w:t>BioBERT v1.1</w:t>
+            </w:r>
+          </w:p>
+        </w:tc>
+        <w:tc>
+          <w:tcPr>
+            <w:tcW w:type="dxa" w:w="2592"/>
+            <w:shd w:fill="FFFFFF"/>
+            <w:tcMar>
+              <w:top w:w="60" w:type="dxa"/>
+              <w:bottom w:w="60" w:type="dxa"/>
+              <w:left w:w="90" w:type="dxa"/>
+              <w:right w:w="90" w:type="dxa"/>
+            </w:tcMar>
+            <w:vAlign w:val="center"/>
+          </w:tcPr>
+          <w:p>
+            <w:pPr>
+              <w:spacing w:before="30" w:after="30"/>
+              <w:jc w:val="center"/>
+            </w:pPr>
+            <w:r/>
+            <w:r>
+              <w:rPr>
+                <w:rFonts w:ascii="Arial" w:hAnsi="Arial"/>
+                <w:b w:val="0"/>
+                <w:color w:val="222222"/>
+                <w:sz w:val="16"/>
+              </w:rPr>
+              <w:t>dmis-lab/biobert-base-cased-v1.1</w:t>
+            </w:r>
+          </w:p>
+        </w:tc>
+        <w:tc>
+          <w:tcPr>
+            <w:tcW w:type="dxa" w:w="2448"/>
+            <w:shd w:fill="FFFFFF"/>
+            <w:tcMar>
+              <w:top w:w="60" w:type="dxa"/>
+              <w:bottom w:w="60" w:type="dxa"/>
+              <w:left w:w="90" w:type="dxa"/>
+              <w:right w:w="90" w:type="dxa"/>
+            </w:tcMar>
+            <w:vAlign w:val="center"/>
+          </w:tcPr>
+          <w:p>
+            <w:pPr>
+              <w:spacing w:before="30" w:after="30"/>
+              <w:jc w:val="center"/>
+            </w:pPr>
+            <w:r/>
+            <w:r>
+              <w:rPr>
+                <w:rFonts w:ascii="Arial" w:hAnsi="Arial"/>
+                <w:b w:val="0"/>
+                <w:color w:val="222222"/>
+                <w:sz w:val="16"/>
+              </w:rPr>
+              <w:t>Biomedical Literature (PubMed &amp; PMC)</w:t>
+            </w:r>
+          </w:p>
+        </w:tc>
+        <w:tc>
+          <w:tcPr>
+            <w:tcW w:type="dxa" w:w="1584"/>
+            <w:shd w:fill="FFFFFF"/>
+            <w:tcMar>
+              <w:top w:w="60" w:type="dxa"/>
+              <w:bottom w:w="60" w:type="dxa"/>
+              <w:left w:w="90" w:type="dxa"/>
+              <w:right w:w="90" w:type="dxa"/>
+            </w:tcMar>
+            <w:vAlign w:val="center"/>
+          </w:tcPr>
+          <w:p>
+            <w:pPr>
+              <w:spacing w:before="30" w:after="30"/>
+              <w:jc w:val="center"/>
+            </w:pPr>
+            <w:r/>
+            <w:r>
+              <w:rPr>
+                <w:rFonts w:ascii="Arial" w:hAnsi="Arial"/>
+                <w:b w:val="0"/>
+                <w:color w:val="222222"/>
+                <w:sz w:val="16"/>
+              </w:rPr>
+              <w:t>0.8471 ± 0.0058</w:t>
+            </w:r>
+          </w:p>
+        </w:tc>
+        <w:tc>
+          <w:tcPr>
+            <w:tcW w:type="dxa" w:w="1440"/>
+            <w:shd w:fill="FFFFFF"/>
+            <w:tcMar>
+              <w:top w:w="60" w:type="dxa"/>
+              <w:bottom w:w="60" w:type="dxa"/>
+              <w:left w:w="90" w:type="dxa"/>
+              <w:right w:w="90" w:type="dxa"/>
+            </w:tcMar>
+            <w:vAlign w:val="center"/>
+          </w:tcPr>
+          <w:p>
+            <w:pPr>
+              <w:spacing w:before="30" w:after="30"/>
+              <w:jc w:val="center"/>
+            </w:pPr>
+            <w:r/>
+            <w:r>
+              <w:rPr>
+                <w:rFonts w:ascii="Arial" w:hAnsi="Arial"/>
+                <w:b w:val="0"/>
+                <w:color w:val="222222"/>
+                <w:sz w:val="16"/>
+              </w:rPr>
+              <w:t>0.8666 ± 0.0048</w:t>
+            </w:r>
+          </w:p>
+        </w:tc>
+        <w:tc>
+          <w:tcPr>
+            <w:tcW w:type="dxa" w:w="1440"/>
+            <w:shd w:fill="FFFFFF"/>
+            <w:tcMar>
+              <w:top w:w="60" w:type="dxa"/>
+              <w:bottom w:w="60" w:type="dxa"/>
+              <w:left w:w="90" w:type="dxa"/>
+              <w:right w:w="90" w:type="dxa"/>
+            </w:tcMar>
+            <w:vAlign w:val="center"/>
+          </w:tcPr>
+          <w:p>
+            <w:pPr>
+              <w:spacing w:before="30" w:after="30"/>
+              <w:jc w:val="center"/>
+            </w:pPr>
+            <w:r/>
+            <w:r>
+              <w:rPr>
+                <w:rFonts w:ascii="Arial" w:hAnsi="Arial"/>
+                <w:b w:val="0"/>
+                <w:color w:val="222222"/>
+                <w:sz w:val="16"/>
+              </w:rPr>
+              <w:t>0.8285 ± 0.0089</w:t>
+            </w:r>
+          </w:p>
+        </w:tc>
+        <w:tc>
+          <w:tcPr>
+            <w:tcW w:type="dxa" w:w="1296"/>
+            <w:shd w:fill="FFFFFF"/>
+            <w:tcMar>
+              <w:top w:w="60" w:type="dxa"/>
+              <w:bottom w:w="60" w:type="dxa"/>
+              <w:left w:w="90" w:type="dxa"/>
+              <w:right w:w="90" w:type="dxa"/>
+            </w:tcMar>
+            <w:vAlign w:val="center"/>
+          </w:tcPr>
+          <w:p>
+            <w:pPr>
+              <w:spacing w:before="30" w:after="30"/>
+              <w:jc w:val="center"/>
+            </w:pPr>
+            <w:r/>
+            <w:r>
+              <w:rPr>
+                <w:rFonts w:ascii="Arial" w:hAnsi="Arial"/>
+                <w:b w:val="0"/>
+                <w:color w:val="222222"/>
+                <w:sz w:val="16"/>
+              </w:rPr>
+              <w:t>0.8500 ± 0.0071</w:t>
+            </w:r>
+          </w:p>
+        </w:tc>
+        <w:tc>
+          <w:tcPr>
+            <w:tcW w:type="dxa" w:w="1296"/>
+            <w:shd w:fill="FFFFFF"/>
+            <w:tcMar>
+              <w:top w:w="60" w:type="dxa"/>
+              <w:bottom w:w="60" w:type="dxa"/>
+              <w:left w:w="90" w:type="dxa"/>
+              <w:right w:w="90" w:type="dxa"/>
+            </w:tcMar>
+            <w:vAlign w:val="center"/>
+          </w:tcPr>
+          <w:p>
+            <w:pPr>
+              <w:spacing w:before="30" w:after="30"/>
+              <w:jc w:val="center"/>
+            </w:pPr>
+            <w:r/>
+            <w:r>
+              <w:rPr>
+                <w:rFonts w:ascii="Arial" w:hAnsi="Arial"/>
+                <w:b w:val="0"/>
+                <w:color w:val="222222"/>
+                <w:sz w:val="16"/>
+              </w:rPr>
+              <w:t>1,800 steps</w:t>
+            </w:r>
+          </w:p>
+        </w:tc>
+      </w:tr>
+      <w:tr>
+        <w:tc>
+          <w:tcPr>
+            <w:tcW w:type="dxa" w:w="1872"/>
+            <w:shd w:fill="FBFBFB"/>
+            <w:tcMar>
+              <w:top w:w="60" w:type="dxa"/>
+              <w:bottom w:w="60" w:type="dxa"/>
+              <w:left w:w="90" w:type="dxa"/>
+              <w:right w:w="90" w:type="dxa"/>
+            </w:tcMar>
+            <w:vAlign w:val="center"/>
+          </w:tcPr>
+          <w:p>
+            <w:pPr>
+              <w:spacing w:before="30" w:after="30"/>
+              <w:jc w:val="left"/>
+            </w:pPr>
+            <w:r/>
+            <w:r>
+              <w:rPr>
+                <w:rFonts w:ascii="Arial" w:hAnsi="Arial"/>
+                <w:b/>
+                <w:color w:val="222222"/>
+                <w:sz w:val="16"/>
+              </w:rPr>
+              <w:t>Bio_ClinicalBERT</w:t>
+            </w:r>
+          </w:p>
+        </w:tc>
+        <w:tc>
+          <w:tcPr>
+            <w:tcW w:type="dxa" w:w="2592"/>
+            <w:shd w:fill="FBFBFB"/>
+            <w:tcMar>
+              <w:top w:w="60" w:type="dxa"/>
+              <w:bottom w:w="60" w:type="dxa"/>
+              <w:left w:w="90" w:type="dxa"/>
+              <w:right w:w="90" w:type="dxa"/>
+            </w:tcMar>
+            <w:vAlign w:val="center"/>
+          </w:tcPr>
+          <w:p>
+            <w:pPr>
+              <w:spacing w:before="30" w:after="30"/>
+              <w:jc w:val="center"/>
+            </w:pPr>
+            <w:r/>
+            <w:r>
+              <w:rPr>
+                <w:rFonts w:ascii="Arial" w:hAnsi="Arial"/>
+                <w:b w:val="0"/>
+                <w:color w:val="222222"/>
+                <w:sz w:val="16"/>
+              </w:rPr>
+              <w:t>emilyalsentzer/Bio_ClinicalBERT</w:t>
+            </w:r>
+          </w:p>
+        </w:tc>
+        <w:tc>
+          <w:tcPr>
+            <w:tcW w:type="dxa" w:w="2448"/>
+            <w:shd w:fill="FBFBFB"/>
+            <w:tcMar>
+              <w:top w:w="60" w:type="dxa"/>
+              <w:bottom w:w="60" w:type="dxa"/>
+              <w:left w:w="90" w:type="dxa"/>
+              <w:right w:w="90" w:type="dxa"/>
+            </w:tcMar>
+            <w:vAlign w:val="center"/>
+          </w:tcPr>
+          <w:p>
+            <w:pPr>
+              <w:spacing w:before="30" w:after="30"/>
+              <w:jc w:val="center"/>
+            </w:pPr>
+            <w:r/>
+            <w:r>
+              <w:rPr>
+                <w:rFonts w:ascii="Arial" w:hAnsi="Arial"/>
+                <w:b/>
+                <w:color w:val="222222"/>
+                <w:sz w:val="16"/>
+              </w:rPr>
+              <w:t>BioBERT + MIMIC-III EHR Notes</w:t>
+            </w:r>
+          </w:p>
+        </w:tc>
+        <w:tc>
+          <w:tcPr>
+            <w:tcW w:type="dxa" w:w="1584"/>
+            <w:shd w:fill="FBFBFB"/>
+            <w:tcMar>
+              <w:top w:w="60" w:type="dxa"/>
+              <w:bottom w:w="60" w:type="dxa"/>
+              <w:left w:w="90" w:type="dxa"/>
+              <w:right w:w="90" w:type="dxa"/>
+            </w:tcMar>
+            <w:vAlign w:val="center"/>
+          </w:tcPr>
+          <w:p>
+            <w:pPr>
+              <w:spacing w:before="30" w:after="30"/>
+              <w:jc w:val="center"/>
+            </w:pPr>
+            <w:r/>
+            <w:r>
+              <w:rPr>
+                <w:rFonts w:ascii="Arial" w:hAnsi="Arial"/>
+                <w:b w:val="0"/>
+                <w:color w:val="222222"/>
+                <w:sz w:val="16"/>
+              </w:rPr>
+              <w:t>0.8433 ± 0.0070</w:t>
+            </w:r>
+          </w:p>
+        </w:tc>
+        <w:tc>
+          <w:tcPr>
+            <w:tcW w:type="dxa" w:w="1440"/>
+            <w:shd w:fill="FBFBFB"/>
+            <w:tcMar>
+              <w:top w:w="60" w:type="dxa"/>
+              <w:bottom w:w="60" w:type="dxa"/>
+              <w:left w:w="90" w:type="dxa"/>
+              <w:right w:w="90" w:type="dxa"/>
+            </w:tcMar>
+            <w:vAlign w:val="center"/>
+          </w:tcPr>
+          <w:p>
+            <w:pPr>
+              <w:spacing w:before="30" w:after="30"/>
+              <w:jc w:val="center"/>
+            </w:pPr>
+            <w:r/>
+            <w:r>
+              <w:rPr>
+                <w:rFonts w:ascii="Arial" w:hAnsi="Arial"/>
+                <w:b w:val="0"/>
+                <w:color w:val="222222"/>
+                <w:sz w:val="16"/>
+              </w:rPr>
+              <w:t>0.8610 ± 0.0078</w:t>
+            </w:r>
+          </w:p>
+        </w:tc>
+        <w:tc>
+          <w:tcPr>
+            <w:tcW w:type="dxa" w:w="1440"/>
+            <w:shd w:fill="FBFBFB"/>
+            <w:tcMar>
+              <w:top w:w="60" w:type="dxa"/>
+              <w:bottom w:w="60" w:type="dxa"/>
+              <w:left w:w="90" w:type="dxa"/>
+              <w:right w:w="90" w:type="dxa"/>
+            </w:tcMar>
+            <w:vAlign w:val="center"/>
+          </w:tcPr>
+          <w:p>
+            <w:pPr>
+              <w:spacing w:before="30" w:after="30"/>
+              <w:jc w:val="center"/>
+            </w:pPr>
+            <w:r/>
+            <w:r>
+              <w:rPr>
+                <w:rFonts w:ascii="Arial" w:hAnsi="Arial"/>
+                <w:b w:val="0"/>
+                <w:color w:val="222222"/>
+                <w:sz w:val="16"/>
+              </w:rPr>
+              <w:t>0.8264 ± 0.0104</w:t>
+            </w:r>
+          </w:p>
+        </w:tc>
+        <w:tc>
+          <w:tcPr>
+            <w:tcW w:type="dxa" w:w="1296"/>
+            <w:shd w:fill="FBFBFB"/>
+            <w:tcMar>
+              <w:top w:w="60" w:type="dxa"/>
+              <w:bottom w:w="60" w:type="dxa"/>
+              <w:left w:w="90" w:type="dxa"/>
+              <w:right w:w="90" w:type="dxa"/>
+            </w:tcMar>
+            <w:vAlign w:val="center"/>
+          </w:tcPr>
+          <w:p>
+            <w:pPr>
+              <w:spacing w:before="30" w:after="30"/>
+              <w:jc w:val="center"/>
+            </w:pPr>
+            <w:r/>
+            <w:r>
+              <w:rPr>
+                <w:rFonts w:ascii="Arial" w:hAnsi="Arial"/>
+                <w:b w:val="0"/>
+                <w:color w:val="222222"/>
+                <w:sz w:val="16"/>
+              </w:rPr>
+              <w:t>0.8440 ± 0.0055</w:t>
+            </w:r>
+          </w:p>
+        </w:tc>
+        <w:tc>
+          <w:tcPr>
+            <w:tcW w:type="dxa" w:w="1296"/>
+            <w:shd w:fill="FBFBFB"/>
+            <w:tcMar>
+              <w:top w:w="60" w:type="dxa"/>
+              <w:bottom w:w="60" w:type="dxa"/>
+              <w:left w:w="90" w:type="dxa"/>
+              <w:right w:w="90" w:type="dxa"/>
+            </w:tcMar>
+            <w:vAlign w:val="center"/>
+          </w:tcPr>
+          <w:p>
+            <w:pPr>
+              <w:spacing w:before="30" w:after="30"/>
+              <w:jc w:val="center"/>
+            </w:pPr>
+            <w:r/>
+            <w:r>
+              <w:rPr>
+                <w:rFonts w:ascii="Arial" w:hAnsi="Arial"/>
+                <w:b w:val="0"/>
+                <w:color w:val="222222"/>
+                <w:sz w:val="16"/>
+              </w:rPr>
+              <w:t>1,080 steps</w:t>
+            </w:r>
+          </w:p>
+        </w:tc>
+      </w:tr>
+      <w:tr>
+        <w:tc>
+          <w:tcPr>
+            <w:tcW w:type="dxa" w:w="1872"/>
+            <w:shd w:fill="FFFFFF"/>
+            <w:tcMar>
+              <w:top w:w="60" w:type="dxa"/>
+              <w:bottom w:w="60" w:type="dxa"/>
+              <w:left w:w="90" w:type="dxa"/>
+              <w:right w:w="90" w:type="dxa"/>
+            </w:tcMar>
+            <w:vAlign w:val="center"/>
+          </w:tcPr>
+          <w:p>
+            <w:pPr>
+              <w:spacing w:before="30" w:after="30"/>
+              <w:jc w:val="left"/>
+            </w:pPr>
+            <w:r/>
+            <w:r>
+              <w:rPr>
+                <w:rFonts w:ascii="Arial" w:hAnsi="Arial"/>
+                <w:b/>
+                <w:color w:val="222222"/>
+                <w:sz w:val="16"/>
+              </w:rPr>
+              <w:t>BERT-Base</w:t>
+            </w:r>
+          </w:p>
+        </w:tc>
+        <w:tc>
+          <w:tcPr>
+            <w:tcW w:type="dxa" w:w="2592"/>
+            <w:shd w:fill="FFFFFF"/>
+            <w:tcMar>
+              <w:top w:w="60" w:type="dxa"/>
+              <w:bottom w:w="60" w:type="dxa"/>
+              <w:left w:w="90" w:type="dxa"/>
+              <w:right w:w="90" w:type="dxa"/>
+            </w:tcMar>
+            <w:vAlign w:val="center"/>
+          </w:tcPr>
+          <w:p>
+            <w:pPr>
+              <w:spacing w:before="30" w:after="30"/>
+              <w:jc w:val="center"/>
+            </w:pPr>
+            <w:r/>
+            <w:r>
+              <w:rPr>
+                <w:rFonts w:ascii="Arial" w:hAnsi="Arial"/>
+                <w:b w:val="0"/>
+                <w:color w:val="222222"/>
+                <w:sz w:val="16"/>
+              </w:rPr>
+              <w:t>bert-base-cased</w:t>
+            </w:r>
+          </w:p>
+        </w:tc>
+        <w:tc>
+          <w:tcPr>
+            <w:tcW w:type="dxa" w:w="2448"/>
+            <w:shd w:fill="FFFFFF"/>
+            <w:tcMar>
+              <w:top w:w="60" w:type="dxa"/>
+              <w:bottom w:w="60" w:type="dxa"/>
+              <w:left w:w="90" w:type="dxa"/>
+              <w:right w:w="90" w:type="dxa"/>
+            </w:tcMar>
+            <w:vAlign w:val="center"/>
+          </w:tcPr>
+          <w:p>
+            <w:pPr>
+              <w:spacing w:before="30" w:after="30"/>
+              <w:jc w:val="center"/>
+            </w:pPr>
+            <w:r/>
+            <w:r>
+              <w:rPr>
+                <w:rFonts w:ascii="Arial" w:hAnsi="Arial"/>
+                <w:b w:val="0"/>
+                <w:color w:val="222222"/>
+                <w:sz w:val="16"/>
+              </w:rPr>
+              <w:t>General Domain (Wikipedia &amp; Books)</w:t>
+            </w:r>
+          </w:p>
+        </w:tc>
+        <w:tc>
+          <w:tcPr>
+            <w:tcW w:type="dxa" w:w="1584"/>
+            <w:shd w:fill="FFFFFF"/>
+            <w:tcMar>
+              <w:top w:w="60" w:type="dxa"/>
+              <w:bottom w:w="60" w:type="dxa"/>
+              <w:left w:w="90" w:type="dxa"/>
+              <w:right w:w="90" w:type="dxa"/>
+            </w:tcMar>
+            <w:vAlign w:val="center"/>
+          </w:tcPr>
+          <w:p>
+            <w:pPr>
+              <w:spacing w:before="30" w:after="30"/>
+              <w:jc w:val="center"/>
+            </w:pPr>
+            <w:r/>
+            <w:r>
+              <w:rPr>
+                <w:rFonts w:ascii="Arial" w:hAnsi="Arial"/>
+                <w:b w:val="0"/>
+                <w:color w:val="222222"/>
+                <w:sz w:val="16"/>
+              </w:rPr>
+              <w:t>0.8382 ± 0.0047</w:t>
+            </w:r>
+          </w:p>
+        </w:tc>
+        <w:tc>
+          <w:tcPr>
+            <w:tcW w:type="dxa" w:w="1440"/>
+            <w:shd w:fill="FFFFFF"/>
+            <w:tcMar>
+              <w:top w:w="60" w:type="dxa"/>
+              <w:bottom w:w="60" w:type="dxa"/>
+              <w:left w:w="90" w:type="dxa"/>
+              <w:right w:w="90" w:type="dxa"/>
+            </w:tcMar>
+            <w:vAlign w:val="center"/>
+          </w:tcPr>
+          <w:p>
+            <w:pPr>
+              <w:spacing w:before="30" w:after="30"/>
+              <w:jc w:val="center"/>
+            </w:pPr>
+            <w:r/>
+            <w:r>
+              <w:rPr>
+                <w:rFonts w:ascii="Arial" w:hAnsi="Arial"/>
+                <w:b w:val="0"/>
+                <w:color w:val="222222"/>
+                <w:sz w:val="16"/>
+              </w:rPr>
+              <w:t>0.8596 ± 0.0055</w:t>
+            </w:r>
+          </w:p>
+        </w:tc>
+        <w:tc>
+          <w:tcPr>
+            <w:tcW w:type="dxa" w:w="1440"/>
+            <w:shd w:fill="FFFFFF"/>
+            <w:tcMar>
+              <w:top w:w="60" w:type="dxa"/>
+              <w:bottom w:w="60" w:type="dxa"/>
+              <w:left w:w="90" w:type="dxa"/>
+              <w:right w:w="90" w:type="dxa"/>
+            </w:tcMar>
+            <w:vAlign w:val="center"/>
+          </w:tcPr>
+          <w:p>
+            <w:pPr>
+              <w:spacing w:before="30" w:after="30"/>
+              <w:jc w:val="center"/>
+            </w:pPr>
+            <w:r/>
+            <w:r>
+              <w:rPr>
+                <w:rFonts w:ascii="Arial" w:hAnsi="Arial"/>
+                <w:b w:val="0"/>
+                <w:color w:val="222222"/>
+                <w:sz w:val="16"/>
+              </w:rPr>
+              <w:t>0.8179 ± 0.0061</w:t>
+            </w:r>
+          </w:p>
+        </w:tc>
+        <w:tc>
+          <w:tcPr>
+            <w:tcW w:type="dxa" w:w="1296"/>
+            <w:shd w:fill="FFFFFF"/>
+            <w:tcMar>
+              <w:top w:w="60" w:type="dxa"/>
+              <w:bottom w:w="60" w:type="dxa"/>
+              <w:left w:w="90" w:type="dxa"/>
+              <w:right w:w="90" w:type="dxa"/>
+            </w:tcMar>
+            <w:vAlign w:val="center"/>
+          </w:tcPr>
+          <w:p>
+            <w:pPr>
+              <w:spacing w:before="30" w:after="30"/>
+              <w:jc w:val="center"/>
+            </w:pPr>
+            <w:r/>
+            <w:r>
+              <w:rPr>
+                <w:rFonts w:ascii="Arial" w:hAnsi="Arial"/>
+                <w:b w:val="0"/>
+                <w:color w:val="222222"/>
+                <w:sz w:val="16"/>
+              </w:rPr>
+              <w:t>0.8420 ± 0.0045</w:t>
+            </w:r>
+          </w:p>
+        </w:tc>
+        <w:tc>
+          <w:tcPr>
+            <w:tcW w:type="dxa" w:w="1296"/>
+            <w:shd w:fill="FFFFFF"/>
+            <w:tcMar>
+              <w:top w:w="60" w:type="dxa"/>
+              <w:bottom w:w="60" w:type="dxa"/>
+              <w:left w:w="90" w:type="dxa"/>
+              <w:right w:w="90" w:type="dxa"/>
+            </w:tcMar>
+            <w:vAlign w:val="center"/>
+          </w:tcPr>
+          <w:p>
+            <w:pPr>
+              <w:spacing w:before="30" w:after="30"/>
+              <w:jc w:val="center"/>
+            </w:pPr>
+            <w:r/>
+            <w:r>
+              <w:rPr>
+                <w:rFonts w:ascii="Arial" w:hAnsi="Arial"/>
+                <w:b w:val="0"/>
+                <w:color w:val="222222"/>
+                <w:sz w:val="16"/>
+              </w:rPr>
+              <w:t>2,160 steps</w:t>
+            </w:r>
+          </w:p>
+        </w:tc>
+      </w:tr>
+      <w:tr>
+        <w:tc>
+          <w:tcPr>
+            <w:tcW w:type="dxa" w:w="1872"/>
+            <w:shd w:fill="FBFBFB"/>
+            <w:tcMar>
+              <w:top w:w="60" w:type="dxa"/>
+              <w:bottom w:w="60" w:type="dxa"/>
+              <w:left w:w="90" w:type="dxa"/>
+              <w:right w:w="90" w:type="dxa"/>
+            </w:tcMar>
+            <w:vAlign w:val="center"/>
+          </w:tcPr>
+          <w:p>
+            <w:pPr>
+              <w:spacing w:before="30" w:after="30"/>
+              <w:jc w:val="left"/>
+            </w:pPr>
+            <w:r/>
+            <w:r>
+              <w:rPr>
+                <w:rFonts w:ascii="Arial" w:hAnsi="Arial"/>
+                <w:b/>
+                <w:color w:val="222222"/>
+                <w:sz w:val="16"/>
+              </w:rPr>
+              <w:t>ClinicalBERT</w:t>
+            </w:r>
+          </w:p>
+        </w:tc>
+        <w:tc>
+          <w:tcPr>
+            <w:tcW w:type="dxa" w:w="2592"/>
+            <w:shd w:fill="FBFBFB"/>
+            <w:tcMar>
+              <w:top w:w="60" w:type="dxa"/>
+              <w:bottom w:w="60" w:type="dxa"/>
+              <w:left w:w="90" w:type="dxa"/>
+              <w:right w:w="90" w:type="dxa"/>
+            </w:tcMar>
+            <w:vAlign w:val="center"/>
+          </w:tcPr>
+          <w:p>
+            <w:pPr>
+              <w:spacing w:before="30" w:after="30"/>
+              <w:jc w:val="center"/>
+            </w:pPr>
+            <w:r/>
+            <w:r>
+              <w:rPr>
+                <w:rFonts w:ascii="Arial" w:hAnsi="Arial"/>
+                <w:b w:val="0"/>
+                <w:color w:val="222222"/>
+                <w:sz w:val="16"/>
+              </w:rPr>
+              <w:t>medicalai/ClinicalBERT</w:t>
+            </w:r>
+          </w:p>
+        </w:tc>
+        <w:tc>
+          <w:tcPr>
+            <w:tcW w:type="dxa" w:w="2448"/>
+            <w:shd w:fill="FBFBFB"/>
+            <w:tcMar>
+              <w:top w:w="60" w:type="dxa"/>
+              <w:bottom w:w="60" w:type="dxa"/>
+              <w:left w:w="90" w:type="dxa"/>
+              <w:right w:w="90" w:type="dxa"/>
+            </w:tcMar>
+            <w:vAlign w:val="center"/>
+          </w:tcPr>
+          <w:p>
+            <w:pPr>
+              <w:spacing w:before="30" w:after="30"/>
+              <w:jc w:val="center"/>
+            </w:pPr>
+            <w:r/>
+            <w:r>
+              <w:rPr>
+                <w:rFonts w:ascii="Arial" w:hAnsi="Arial"/>
+                <w:b w:val="0"/>
+                <w:color w:val="222222"/>
+                <w:sz w:val="16"/>
+              </w:rPr>
+              <w:t>Hospital EHR Records (MIMIC-III)</w:t>
+            </w:r>
+          </w:p>
+        </w:tc>
+        <w:tc>
+          <w:tcPr>
+            <w:tcW w:type="dxa" w:w="1584"/>
+            <w:shd w:fill="FBFBFB"/>
+            <w:tcMar>
+              <w:top w:w="60" w:type="dxa"/>
+              <w:bottom w:w="60" w:type="dxa"/>
+              <w:left w:w="90" w:type="dxa"/>
+              <w:right w:w="90" w:type="dxa"/>
+            </w:tcMar>
+            <w:vAlign w:val="center"/>
+          </w:tcPr>
+          <w:p>
+            <w:pPr>
+              <w:spacing w:before="30" w:after="30"/>
+              <w:jc w:val="center"/>
+            </w:pPr>
+            <w:r/>
+            <w:r>
+              <w:rPr>
+                <w:rFonts w:ascii="Arial" w:hAnsi="Arial"/>
+                <w:b w:val="0"/>
+                <w:color w:val="222222"/>
+                <w:sz w:val="16"/>
+              </w:rPr>
+              <w:t>0.8369 ± 0.0086</w:t>
+            </w:r>
+          </w:p>
+        </w:tc>
+        <w:tc>
+          <w:tcPr>
+            <w:tcW w:type="dxa" w:w="1440"/>
+            <w:shd w:fill="FBFBFB"/>
+            <w:tcMar>
+              <w:top w:w="60" w:type="dxa"/>
+              <w:bottom w:w="60" w:type="dxa"/>
+              <w:left w:w="90" w:type="dxa"/>
+              <w:right w:w="90" w:type="dxa"/>
+            </w:tcMar>
+            <w:vAlign w:val="center"/>
+          </w:tcPr>
+          <w:p>
+            <w:pPr>
+              <w:spacing w:before="30" w:after="30"/>
+              <w:jc w:val="center"/>
+            </w:pPr>
+            <w:r/>
+            <w:r>
+              <w:rPr>
+                <w:rFonts w:ascii="Arial" w:hAnsi="Arial"/>
+                <w:b w:val="0"/>
+                <w:color w:val="222222"/>
+                <w:sz w:val="16"/>
+              </w:rPr>
+              <w:t>0.8615 ± 0.0106</w:t>
+            </w:r>
+          </w:p>
+        </w:tc>
+        <w:tc>
+          <w:tcPr>
+            <w:tcW w:type="dxa" w:w="1440"/>
+            <w:shd w:fill="FBFBFB"/>
+            <w:tcMar>
+              <w:top w:w="60" w:type="dxa"/>
+              <w:bottom w:w="60" w:type="dxa"/>
+              <w:left w:w="90" w:type="dxa"/>
+              <w:right w:w="90" w:type="dxa"/>
+            </w:tcMar>
+            <w:vAlign w:val="center"/>
+          </w:tcPr>
+          <w:p>
+            <w:pPr>
+              <w:spacing w:before="30" w:after="30"/>
+              <w:jc w:val="center"/>
+            </w:pPr>
+            <w:r/>
+            <w:r>
+              <w:rPr>
+                <w:rFonts w:ascii="Arial" w:hAnsi="Arial"/>
+                <w:b w:val="0"/>
+                <w:color w:val="222222"/>
+                <w:sz w:val="16"/>
+              </w:rPr>
+              <w:t>0.8140 ± 0.0167</w:t>
+            </w:r>
+          </w:p>
+        </w:tc>
+        <w:tc>
+          <w:tcPr>
+            <w:tcW w:type="dxa" w:w="1296"/>
+            <w:shd w:fill="FBFBFB"/>
+            <w:tcMar>
+              <w:top w:w="60" w:type="dxa"/>
+              <w:bottom w:w="60" w:type="dxa"/>
+              <w:left w:w="90" w:type="dxa"/>
+              <w:right w:w="90" w:type="dxa"/>
+            </w:tcMar>
+            <w:vAlign w:val="center"/>
+          </w:tcPr>
+          <w:p>
+            <w:pPr>
+              <w:spacing w:before="30" w:after="30"/>
+              <w:jc w:val="center"/>
+            </w:pPr>
+            <w:r/>
+            <w:r>
+              <w:rPr>
+                <w:rFonts w:ascii="Arial" w:hAnsi="Arial"/>
+                <w:b w:val="0"/>
+                <w:color w:val="222222"/>
+                <w:sz w:val="16"/>
+              </w:rPr>
+              <w:t>0.8400 ± 0.0071</w:t>
+            </w:r>
+          </w:p>
+        </w:tc>
+        <w:tc>
+          <w:tcPr>
+            <w:tcW w:type="dxa" w:w="1296"/>
+            <w:shd w:fill="FBFBFB"/>
+            <w:tcMar>
+              <w:top w:w="60" w:type="dxa"/>
+              <w:bottom w:w="60" w:type="dxa"/>
+              <w:left w:w="90" w:type="dxa"/>
+              <w:right w:w="90" w:type="dxa"/>
+            </w:tcMar>
+            <w:vAlign w:val="center"/>
+          </w:tcPr>
+          <w:p>
+            <w:pPr>
+              <w:spacing w:before="30" w:after="30"/>
+              <w:jc w:val="center"/>
+            </w:pPr>
+            <w:r/>
+            <w:r>
+              <w:rPr>
+                <w:rFonts w:ascii="Arial" w:hAnsi="Arial"/>
+                <w:b w:val="0"/>
+                <w:color w:val="222222"/>
+                <w:sz w:val="16"/>
+              </w:rPr>
+              <w:t>1,640 steps</w:t>
             </w:r>
           </w:p>
         </w:tc>

</xml_diff>